<commit_message>
Reframe stakeholder summary as product-driven three-tier story
Restructure the one-pager around the product journey: Foundation
(own the test cycle) -> Test Automation (scale execution) -> AI
(do the testing work). Rewords engineering-metric language into
product value and reorders sections so AI lands as the culminating
layer on a working foundation.

Co-Authored-By: Claude Opus 4.8 <noreply@anthropic.com>
Claude-Session: https://claude.ai/code/session_01KWHFp6D1vP9g3jVVV1u2Yq
</commit_message>
<xml_diff>
--- a/docs/Stakeholder-Summary.docx
+++ b/docs/Stakeholder-Summary.docx
@@ -25,7 +25,7 @@
           <w:color w:val="2B5CE6"/>
           <w:sz w:val="20"/>
         </w:rPr>
-        <w:t>Cross-team quality intelligence — shipped capabilities at a glance</w:t>
+        <w:t>One product for the whole test cycle — manage it, automate it, then let AI do the work</w:t>
       </w:r>
     </w:p>
     <w:p>
@@ -78,7 +78,7 @@
                 <w:color w:val="2B5CE6"/>
                 <w:sz w:val="30"/>
               </w:rPr>
-              <w:t>11</w:t>
+              <w:t>1</w:t>
             </w:r>
           </w:p>
           <w:p>
@@ -91,40 +91,7 @@
                 <w:color w:val="5A5A6E"/>
                 <w:sz w:val="15"/>
               </w:rPr>
-              <w:t>backend services</w:t>
-            </w:r>
-          </w:p>
-        </w:tc>
-        <w:tc>
-          <w:tcPr>
-            <w:tcW w:type="dxa" w:w="2102"/>
-            <w:shd w:val="clear" w:fill="F2F5FF"/>
-          </w:tcPr>
-          <w:p>
-            <w:pPr>
-              <w:spacing w:after="0" w:before="0"/>
-              <w:jc w:val="center"/>
-            </w:pPr>
-            <w:r>
-              <w:rPr>
-                <w:b/>
-                <w:color w:val="2B5CE6"/>
-                <w:sz w:val="30"/>
-              </w:rPr>
-              <w:t>467</w:t>
-            </w:r>
-          </w:p>
-          <w:p>
-            <w:pPr>
-              <w:spacing w:after="0" w:before="0"/>
-              <w:jc w:val="center"/>
-            </w:pPr>
-            <w:r>
-              <w:rPr>
-                <w:color w:val="5A5A6E"/>
-                <w:sz w:val="15"/>
-              </w:rPr>
-              <w:t>REST APIs</w:t>
+              <w:t>portal, whole cycle</w:t>
             </w:r>
           </w:p>
         </w:tc>
@@ -157,7 +124,7 @@
                 <w:color w:val="5A5A6E"/>
                 <w:sz w:val="15"/>
               </w:rPr>
-              <w:t>test frameworks ingested</w:t>
+              <w:t>CI frameworks in</w:t>
             </w:r>
           </w:p>
         </w:tc>
@@ -190,7 +157,7 @@
                 <w:color w:val="5A5A6E"/>
                 <w:sz w:val="15"/>
               </w:rPr>
-              <w:t>portal screens</w:t>
+              <w:t>product screens</w:t>
             </w:r>
           </w:p>
         </w:tc>
@@ -210,7 +177,7 @@
                 <w:color w:val="2B5CE6"/>
                 <w:sz w:val="30"/>
               </w:rPr>
-              <w:t>92</w:t>
+              <w:t>3</w:t>
             </w:r>
           </w:p>
           <w:p>
@@ -223,7 +190,40 @@
                 <w:color w:val="5A5A6E"/>
                 <w:sz w:val="15"/>
               </w:rPr>
-              <w:t>automated test suites</w:t>
+              <w:t>trackers connected</w:t>
+            </w:r>
+          </w:p>
+        </w:tc>
+        <w:tc>
+          <w:tcPr>
+            <w:tcW w:type="dxa" w:w="2102"/>
+            <w:shd w:val="clear" w:fill="F2F5FF"/>
+          </w:tcPr>
+          <w:p>
+            <w:pPr>
+              <w:spacing w:after="0" w:before="0"/>
+              <w:jc w:val="center"/>
+            </w:pPr>
+            <w:r>
+              <w:rPr>
+                <w:b/>
+                <w:color w:val="2B5CE6"/>
+                <w:sz w:val="30"/>
+              </w:rPr>
+              <w:t>5</w:t>
+            </w:r>
+          </w:p>
+          <w:p>
+            <w:pPr>
+              <w:spacing w:after="0" w:before="0"/>
+              <w:jc w:val="center"/>
+            </w:pPr>
+            <w:r>
+              <w:rPr>
+                <w:color w:val="5A5A6E"/>
+                <w:sz w:val="15"/>
+              </w:rPr>
+              <w:t>AI workflows</w:t>
             </w:r>
           </w:p>
         </w:tc>
@@ -236,15 +236,32 @@
     </w:p>
     <w:p>
       <w:pPr>
-        <w:spacing w:after="40" w:before="100"/>
+        <w:spacing w:after="40" w:before="120"/>
       </w:pPr>
+      <w:r>
+        <w:rPr>
+          <w:b/>
+          <w:color w:val="FFFFFF"/>
+          <w:sz w:val="19"/>
+          <w:shd w:val="clear" w:fill="2B5CE6"/>
+        </w:rPr>
+        <w:t xml:space="preserve"> 1 </w:t>
+      </w:r>
       <w:r>
         <w:rPr>
           <w:b/>
           <w:color w:val="1A1A2E"/>
           <w:sz w:val="19"/>
         </w:rPr>
-        <w:t>THE HEADLINE: AN AI ENGINEER FOR YOUR TEST SUITE</w:t>
+        <w:t xml:space="preserve">  FOUNDATION — OWN THE TEST CYCLE</w:t>
+      </w:r>
+      <w:r>
+        <w:rPr>
+          <w:i/>
+          <w:color w:val="5A5A6E"/>
+          <w:sz w:val="17"/>
+        </w:rPr>
+        <w:t xml:space="preserve">   plan, cover, execute, decide</w:t>
       </w:r>
     </w:p>
     <w:p>
@@ -264,14 +281,14 @@
           <w:b/>
           <w:sz w:val="19"/>
         </w:rPr>
-        <w:t xml:space="preserve">Autonomous failure triage  </w:t>
+        <w:t xml:space="preserve">Test case management, end to end  </w:t>
       </w:r>
       <w:r>
         <w:rPr>
           <w:color w:val="1A1A2E"/>
           <w:sz w:val="18"/>
         </w:rPr>
-        <w:t>— every test failure is classified by an LLM (Claude/OpenAI via a gateway) into a root-cause category, with a nightly batch job that clears the backlog while the team sleeps.</w:t>
+        <w:t>— author, review, and version test cases with steps, priorities, and suites — the single source of truth for what gets tested, across the whole team.</w:t>
       </w:r>
     </w:p>
     <w:p>
@@ -291,14 +308,14 @@
           <w:b/>
           <w:sz w:val="19"/>
         </w:rPr>
-        <w:t xml:space="preserve">Agentic workflows that write code  </w:t>
+        <w:t xml:space="preserve">Requirements, traceability &amp; coverage  </w:t>
       </w:r>
       <w:r>
         <w:rPr>
           <w:color w:val="1A1A2E"/>
           <w:sz w:val="18"/>
         </w:rPr>
-        <w:t>— a self-hosted Agent Hub runs multi-step LLM workflows to generate test cases from requirements, produce runnable automation code, analyze the blast radius of a pull request, and self-heal flaky tests — every proposal gated by a human review queue.</w:t>
+        <w:t>— link every requirement to the tests that cover it; a live coverage matrix shows exactly what is protected and where the gaps are.</w:t>
       </w:r>
     </w:p>
     <w:p>
@@ -318,27 +335,44 @@
           <w:b/>
           <w:sz w:val="19"/>
         </w:rPr>
-        <w:t xml:space="preserve">Test Impact Analysis  </w:t>
+        <w:t xml:space="preserve">Run cycles and decide with confidence  </w:t>
       </w:r>
       <w:r>
         <w:rPr>
           <w:color w:val="1A1A2E"/>
           <w:sz w:val="18"/>
         </w:rPr>
-        <w:t>— maps code changes to the exact tests that exercise them, so CI runs the affected slice instead of the whole suite — faster feedback, lower compute.</w:t>
+        <w:t>— execute manual test runs, then read pass-rate trends, quality gates, and release-readiness reports to make a clear go / no-go call.</w:t>
       </w:r>
     </w:p>
     <w:p>
       <w:pPr>
-        <w:spacing w:after="40" w:before="100"/>
+        <w:spacing w:after="40" w:before="120"/>
       </w:pPr>
+      <w:r>
+        <w:rPr>
+          <w:b/>
+          <w:color w:val="FFFFFF"/>
+          <w:sz w:val="19"/>
+          <w:shd w:val="clear" w:fill="2B5CE6"/>
+        </w:rPr>
+        <w:t xml:space="preserve"> 2 </w:t>
+      </w:r>
       <w:r>
         <w:rPr>
           <w:b/>
           <w:color w:val="1A1A2E"/>
           <w:sz w:val="19"/>
         </w:rPr>
-        <w:t>QUALITY INTELLIGENCE, RUNNING TODAY</w:t>
+        <w:t xml:space="preserve">  TEST AUTOMATION — SCALE EXECUTION</w:t>
+      </w:r>
+      <w:r>
+        <w:rPr>
+          <w:i/>
+          <w:color w:val="5A5A6E"/>
+          <w:sz w:val="17"/>
+        </w:rPr>
+        <w:t xml:space="preserve">   every run, every framework, one view</w:t>
       </w:r>
     </w:p>
     <w:p>
@@ -358,14 +392,14 @@
           <w:b/>
           <w:sz w:val="19"/>
         </w:rPr>
-        <w:t xml:space="preserve">Flakiness scoring + auto-ticketing  </w:t>
+        <w:t xml:space="preserve">Bring every result together  </w:t>
       </w:r>
       <w:r>
         <w:rPr>
           <w:color w:val="1A1A2E"/>
           <w:sz w:val="18"/>
         </w:rPr>
-        <w:t>— quantifies unstable tests from execution history and opens Jira tickets automatically for repeat offenders.</w:t>
+        <w:t>— one pipeline captures results from 9 CI frameworks out of the box — JUnit, TestNG, Cucumber, Allure, Playwright, Postman/Newman, k6, Gatling, JMeter.</w:t>
       </w:r>
     </w:p>
     <w:p>
@@ -385,14 +419,14 @@
           <w:b/>
           <w:sz w:val="19"/>
         </w:rPr>
-        <w:t xml:space="preserve">Quality gates, trends &amp; release reports  </w:t>
+        <w:t xml:space="preserve">One estate, automated + manual  </w:t>
       </w:r>
       <w:r>
         <w:rPr>
           <w:color w:val="1A1A2E"/>
           <w:sz w:val="18"/>
         </w:rPr>
-        <w:t>— pass-rate trends, risk scoring, and go/no-go release readiness — the signals a release manager actually needs.</w:t>
+        <w:t>— automated suites, GitHub CI workflows, and execution history sit alongside manual tests, so leaders see the full test estate in a single portal.</w:t>
       </w:r>
     </w:p>
     <w:p>
@@ -412,27 +446,44 @@
           <w:b/>
           <w:sz w:val="19"/>
         </w:rPr>
-        <w:t xml:space="preserve">Universal ingestion  </w:t>
+        <w:t xml:space="preserve">Close the loop into the tools teams use  </w:t>
       </w:r>
       <w:r>
         <w:rPr>
           <w:color w:val="1A1A2E"/>
           <w:sz w:val="18"/>
         </w:rPr>
-        <w:t>— one pipeline parses 9 frameworks out of the box: JUnit, TestNG, Cucumber, Allure, Playwright, Postman/Newman, k6, Gatling, and JMeter.</w:t>
+        <w:t>— flakiness scoring turns noisy CI into tracked work by auto-filing Jira tickets, with live Jira, GitHub, and Azure DevOps integrations (guided ADO onboarding).</w:t>
       </w:r>
     </w:p>
     <w:p>
       <w:pPr>
-        <w:spacing w:after="40" w:before="100"/>
+        <w:spacing w:after="40" w:before="120"/>
       </w:pPr>
+      <w:r>
+        <w:rPr>
+          <w:b/>
+          <w:color w:val="FFFFFF"/>
+          <w:sz w:val="19"/>
+          <w:shd w:val="clear" w:fill="2B5CE6"/>
+        </w:rPr>
+        <w:t xml:space="preserve"> 3 </w:t>
+      </w:r>
       <w:r>
         <w:rPr>
           <w:b/>
           <w:color w:val="1A1A2E"/>
           <w:sz w:val="19"/>
         </w:rPr>
-        <w:t>ENTERPRISE-READY FOUNDATION</w:t>
+        <w:t xml:space="preserve">  AI — DO THE TESTING WORK</w:t>
+      </w:r>
+      <w:r>
+        <w:rPr>
+          <w:i/>
+          <w:color w:val="5A5A6E"/>
+          <w:sz w:val="17"/>
+        </w:rPr>
+        <w:t xml:space="preserve">   triage, generate, fix, focus</w:t>
       </w:r>
     </w:p>
     <w:p>
@@ -452,14 +503,14 @@
           <w:b/>
           <w:sz w:val="19"/>
         </w:rPr>
-        <w:t xml:space="preserve">Full test-case management  </w:t>
+        <w:t xml:space="preserve">Failures triaged automatically  </w:t>
       </w:r>
       <w:r>
         <w:rPr>
           <w:color w:val="1A1A2E"/>
           <w:sz w:val="18"/>
         </w:rPr>
-        <w:t>— requirements, traceability, coverage matrix, suites, and manual + automated runs in one portal (33 screens).</w:t>
+        <w:t>— every failure is classified to a root cause by an LLM, with a nightly batch that clears the backlog overnight — so mornings start with answers, not logs.</w:t>
       </w:r>
     </w:p>
     <w:p>
@@ -479,14 +530,14 @@
           <w:b/>
           <w:sz w:val="19"/>
         </w:rPr>
-        <w:t xml:space="preserve">Plugs into the toolchain  </w:t>
+        <w:t xml:space="preserve">Agents that generate and fix  </w:t>
       </w:r>
       <w:r>
         <w:rPr>
           <w:color w:val="1A1A2E"/>
           <w:sz w:val="18"/>
         </w:rPr>
-        <w:t>— live Jira, GitHub, and Azure DevOps integrations, including a guided Azure DevOps onboarding wizard.</w:t>
+        <w:t>— generate test cases from requirements, produce runnable automation code, analyze a pull request's blast radius, and propose flaky-test fixes — every change gated by a human review queue.</w:t>
       </w:r>
     </w:p>
     <w:p>
@@ -506,14 +557,14 @@
           <w:b/>
           <w:sz w:val="19"/>
         </w:rPr>
-        <w:t xml:space="preserve">Built for teams  </w:t>
+        <w:t xml:space="preserve">Run only what a change touches  </w:t>
       </w:r>
       <w:r>
         <w:rPr>
           <w:color w:val="1A1A2E"/>
           <w:sz w:val="18"/>
         </w:rPr>
-        <w:t>— role-based access control, multi-org tenancy, API keys, event streaming (Kafka), and a full observability stack (Grafana/Prometheus/Loki).</w:t>
+        <w:t>— Test Impact Analysis maps a code change to the exact tests that exercise it, cutting CI time and cost without losing coverage.</w:t>
       </w:r>
     </w:p>
     <w:p>
@@ -545,14 +596,14 @@
                 <w:color w:val="0E7A4B"/>
                 <w:sz w:val="18"/>
               </w:rPr>
-              <w:t xml:space="preserve">Where it stands   </w:t>
+              <w:t xml:space="preserve">The bet   </w:t>
             </w:r>
             <w:r>
               <w:rPr>
                 <w:color w:val="1A1A2E"/>
                 <w:sz w:val="17"/>
               </w:rPr>
-              <w:t>These are working services with automated test coverage and a documented cloud cost model (~$170–230/mo compute, LLM tokens separate) — not slideware. The next mile is scale hardening, connector breadth, and production pilots with real teams.</w:t>
+              <w:t>Every layer above is working product with automated test coverage and a documented cost model (~$170–230/mo compute, LLM tokens separate) — not slideware. Teams get value from day one at the foundation; the AI layer compounds it. Next: scale hardening, more connectors, and pilots with real teams.</w:t>
             </w:r>
           </w:p>
         </w:tc>

</xml_diff>

<commit_message>
Foreground Azure DevOps + GitHub as the live integration story
Focus the summary on the toolchain in use today: add a 'works in
your stack' ribbon for ADO + GitHub, sync requirements from ADO work
items, file tracked work into ADO, and surface AI agents acting inside
GitHub pull requests. Drops Jira from the highlighted copy.

Co-Authored-By: Claude Opus 4.8 <noreply@anthropic.com>
Claude-Session: https://claude.ai/code/session_01KWHFp6D1vP9g3jVVV1u2Yq
</commit_message>
<xml_diff>
--- a/docs/Stakeholder-Summary.docx
+++ b/docs/Stakeholder-Summary.docx
@@ -177,7 +177,7 @@
                 <w:color w:val="2B5CE6"/>
                 <w:sz w:val="30"/>
               </w:rPr>
-              <w:t>3</w:t>
+              <w:t>2</w:t>
             </w:r>
           </w:p>
           <w:p>
@@ -190,7 +190,7 @@
                 <w:color w:val="5A5A6E"/>
                 <w:sz w:val="15"/>
               </w:rPr>
-              <w:t>trackers connected</w:t>
+              <w:t>live: ADO + GitHub</w:t>
             </w:r>
           </w:p>
         </w:tc>
@@ -224,6 +224,43 @@
                 <w:sz w:val="15"/>
               </w:rPr>
               <w:t>AI workflows</w:t>
+            </w:r>
+          </w:p>
+        </w:tc>
+      </w:tr>
+    </w:tbl>
+    <w:tbl>
+      <w:tblPr>
+        <w:tblW w:type="auto" w:w="0"/>
+        <w:tblLook w:firstColumn="1" w:firstRow="1" w:lastColumn="0" w:lastRow="0" w:noHBand="0" w:noVBand="1" w:val="04A0"/>
+      </w:tblPr>
+      <w:tblGrid>
+        <w:gridCol w:w="10512"/>
+      </w:tblGrid>
+      <w:tr>
+        <w:tc>
+          <w:tcPr>
+            <w:tcW w:type="dxa" w:w="10512"/>
+            <w:shd w:val="clear" w:fill="1A1A2E"/>
+          </w:tcPr>
+          <w:p>
+            <w:pPr>
+              <w:spacing w:after="0" w:before="0"/>
+            </w:pPr>
+            <w:r>
+              <w:rPr>
+                <w:b/>
+                <w:color w:val="8FB0FF"/>
+                <w:sz w:val="17"/>
+              </w:rPr>
+              <w:t xml:space="preserve">WORKS IN YOUR STACK TODAY   </w:t>
+            </w:r>
+            <w:r>
+              <w:rPr>
+                <w:color w:val="EAEEFF"/>
+                <w:sz w:val="17"/>
+              </w:rPr>
+              <w:t>Azure DevOps — import projects, areas, iterations, teams &amp; work items as requirements, with field mapping and a guided onboarding wizard.   ·   GitHub — CI results in, and agents open pull requests, commit fixes, and comment on PRs. No rip-and-replace.</w:t>
             </w:r>
           </w:p>
         </w:tc>
@@ -315,7 +352,7 @@
           <w:color w:val="1A1A2E"/>
           <w:sz w:val="18"/>
         </w:rPr>
-        <w:t>— link every requirement to the tests that cover it; a live coverage matrix shows exactly what is protected and where the gaps are.</w:t>
+        <w:t>— sync requirements straight from Azure DevOps work items, link each to the tests that cover it, and read a live coverage matrix of what is protected and where the gaps are.</w:t>
       </w:r>
     </w:p>
     <w:p>
@@ -446,14 +483,14 @@
           <w:b/>
           <w:sz w:val="19"/>
         </w:rPr>
-        <w:t xml:space="preserve">Close the loop into the tools teams use  </w:t>
+        <w:t xml:space="preserve">Close the loop in the tools teams already use  </w:t>
       </w:r>
       <w:r>
         <w:rPr>
           <w:color w:val="1A1A2E"/>
           <w:sz w:val="18"/>
         </w:rPr>
-        <w:t>— flakiness scoring turns noisy CI into tracked work by auto-filing Jira tickets, with live Jira, GitHub, and Azure DevOps integrations (guided ADO onboarding).</w:t>
+        <w:t>— GitHub CI feeds results in automatically, and flakiness scoring turns noisy runs into tracked work filed straight into Azure DevOps — teams stay in ADO and GitHub, no new tool to adopt.</w:t>
       </w:r>
     </w:p>
     <w:p>
@@ -530,14 +567,14 @@
           <w:b/>
           <w:sz w:val="19"/>
         </w:rPr>
-        <w:t xml:space="preserve">Agents that generate and fix  </w:t>
+        <w:t xml:space="preserve">Agents that generate and fix — inside GitHub  </w:t>
       </w:r>
       <w:r>
         <w:rPr>
           <w:color w:val="1A1A2E"/>
           <w:sz w:val="18"/>
         </w:rPr>
-        <w:t>— generate test cases from requirements, produce runnable automation code, analyze a pull request's blast radius, and propose flaky-test fixes — every change gated by a human review queue.</w:t>
+        <w:t>— from an ADO requirement, agents generate test cases, write runnable automation code, and propose flaky-test fixes as GitHub pull requests, plus comment a change's blast radius on the PR — every change gated by a human review queue.</w:t>
       </w:r>
     </w:p>
     <w:p>
@@ -603,7 +640,7 @@
                 <w:color w:val="1A1A2E"/>
                 <w:sz w:val="17"/>
               </w:rPr>
-              <w:t>Every layer above is working product with automated test coverage and a documented cost model (~$170–230/mo compute, LLM tokens separate) — not slideware. Teams get value from day one at the foundation; the AI layer compounds it. Next: scale hardening, more connectors, and pilots with real teams.</w:t>
+              <w:t>Every layer above is working product, wired to the Azure DevOps + GitHub stack teams use today, with a documented cost model (~$170–230/mo compute, LLM tokens separate) — not slideware. Value from day one at the foundation; the AI layer compounds it. Next: scale hardening, more connectors, and pilots with real teams.</w:t>
             </w:r>
           </w:p>
         </w:tc>

</xml_diff>